<commit_message>
release: 0.17.0 "Trusted, Effortless & Beautiful"
- version 0.17.0 everywhere (pyproject is the single source; CLI and /health read it);
  CHANGELOG [0.17.0] consolidates roadmap v7 Waves 0-5 + follow-ups; AGENTS.md synced
- methodology 1.1.0: per-SDG core metric sets rebuilt (half the IDs pointed at the
  wrong IRIS+ metric), own-footprint metrics and footprint-only sentences no longer
  drive SDG 13; guard tests for every core-set entry
- engagement view: completion percentages scaled, 'no checklist' state, no date wrapping;
  visual QA covers it
- demo regenerated (adds engagements.html); all README/demo screenshots recaptured,
  web shots reproducible via capture_screenshots.py --seed-web; README updated (849 lines)

Co-Authored-By: Claude Opus 5.5 <noreply@anthropic.com>
</commit_message>
<xml_diff>
--- a/demo/brightpath_finance/brightpath_finance_dd_questionnaire.docx
+++ b/demo/brightpath_finance/brightpath_finance_dd_questionnaire.docx
@@ -22,7 +22,7 @@
     </w:p>
     <w:p>
       <w:r>
-        <w:t>Prepared: 2026-10-06   ·   Reviewer: Impact Vision</w:t>
+        <w:t>Prepared: 2026-10-07   ·   Reviewer: Impact Vision</w:t>
       </w:r>
     </w:p>
     <w:p>
@@ -2427,6 +2427,19 @@
       </w:r>
       <w:r>
         <w:t xml:space="preserve">  (1 related question)</w:t>
+      </w:r>
+    </w:p>
+    <w:p>
+      <w:pPr>
+        <w:pStyle w:val="Heading1"/>
+      </w:pPr>
+      <w:r>
+        <w:t>AI &amp; automation disclosure</w:t>
+      </w:r>
+    </w:p>
+    <w:p>
+      <w:r>
+        <w:t>Questions and coverage were generated by keyword rules over the source document (no generative AI). Machine-generated document: produced automatically from the supplied inputs; it may contain automatically extracted or estimated figures. Review before relying on it.</w:t>
       </w:r>
     </w:p>
     <w:p>

</xml_diff>

<commit_message>
release: 0.17.1 — report styling pass across every deliverable
- fix self-referencing --warning token (memo/DD warning styles rendered black)
- IC memo: needs-data tones, evidence-to-collect callout, recommendation tone, gate tile;
  real Word output (runs, tables, house style, page numbers); DD .docx shares the style
- decision report: named metrics in ledger, non-wrapping pills, over-threshold greenwashing
  bars (warning + marker + legend), merged duplicate actions, named IDs, sorted goals
- shared CSS: flat token bars, status-only tile accents, nowrap pills, callout lists;
  grade colours on ink tokens (AA); DD tags humanized; portal centred + tokenized
- demo and screenshots regenerated; visual QA covers engagements

Co-Authored-By: Claude Opus 5.5 <noreply@anthropic.com>
</commit_message>
<xml_diff>
--- a/demo/brightpath_finance/brightpath_finance_dd_questionnaire.docx
+++ b/demo/brightpath_finance/brightpath_finance_dd_questionnaire.docx
@@ -2466,13 +2466,39 @@
       </w:r>
     </w:p>
     <w:sectPr>
+      <w:footerReference w:type="default" r:id="rId9"/>
       <w:pgSz w:w="12240" w:h="15840"/>
-      <w:pgMar w:top="1440" w:right="1800" w:bottom="1440" w:left="1800" w:header="720" w:footer="720" w:gutter="0"/>
+      <w:pgMar w:top="1134" w:right="1247" w:bottom="1134" w:left="1247" w:header="720" w:footer="720" w:gutter="0"/>
       <w:cols w:space="720"/>
       <w:docGrid w:linePitch="360"/>
     </w:sectPr>
   </w:body>
 </w:document>
+</file>
+
+<file path=word/footer1.xml><?xml version="1.0" encoding="utf-8"?>
+<w:ftr xmlns:m="http://schemas.openxmlformats.org/officeDocument/2006/math" xmlns:mc="http://schemas.openxmlformats.org/markup-compatibility/2006" xmlns:mo="http://schemas.microsoft.com/office/mac/office/2008/main" xmlns:mv="urn:schemas-microsoft-com:mac:vml" xmlns:o="urn:schemas-microsoft-com:office:office" xmlns:r="http://schemas.openxmlformats.org/officeDocument/2006/relationships" xmlns:v="urn:schemas-microsoft-com:vml" xmlns:w10="urn:schemas-microsoft-com:office:word" xmlns:w14="http://schemas.microsoft.com/office/word/2010/wordml" xmlns:w="http://schemas.openxmlformats.org/wordprocessingml/2006/main" xmlns:wne="http://schemas.microsoft.com/office/word/2006/wordml" xmlns:wp14="http://schemas.microsoft.com/office/word/2010/wordprocessingDrawing" xmlns:wp="http://schemas.openxmlformats.org/drawingml/2006/wordprocessingDrawing" xmlns:wpc="http://schemas.microsoft.com/office/word/2010/wordprocessingCanvas" xmlns:wpg="http://schemas.microsoft.com/office/word/2010/wordprocessingGroup" xmlns:wpi="http://schemas.microsoft.com/office/word/2010/wordprocessingInk" xmlns:wps="http://schemas.microsoft.com/office/word/2010/wordprocessingShape" mc:Ignorable="w14 wp14">
+  <w:p>
+    <w:pPr>
+      <w:pStyle w:val="Footer"/>
+    </w:pPr>
+    <w:r>
+      <w:rPr>
+        <w:color w:val="6B6B6B"/>
+        <w:sz w:val="16"/>
+      </w:rPr>
+      <w:t xml:space="preserve">Impact Vision · DD questionnaire · BrightPath Finance · Page </w:t>
+    </w:r>
+    <w:r>
+      <w:rPr>
+        <w:sz w:val="16"/>
+      </w:rPr>
+      <w:fldChar w:fldCharType="begin"/>
+      <w:instrText xml:space="preserve">PAGE</w:instrText>
+      <w:fldChar w:fldCharType="end"/>
+    </w:r>
+  </w:p>
+</w:ftr>
 </file>
 
 <file path=word/numbering.xml><?xml version="1.0" encoding="utf-8"?>
@@ -2838,6 +2864,13 @@
     <w:name w:val="Normal"/>
     <w:qFormat/>
     <w:rsid w:val="00FC693F"/>
+    <w:pPr>
+      <w:spacing w:after="80"/>
+    </w:pPr>
+    <w:rPr>
+      <w:rFonts w:ascii="Calibri" w:hAnsi="Calibri"/>
+      <w:sz w:val="21"/>
+    </w:rPr>
   </w:style>
   <w:style w:type="paragraph" w:styleId="Header">
     <w:name w:val="header"/>
@@ -2898,10 +2931,10 @@
       <w:outlineLvl w:val="0"/>
     </w:pPr>
     <w:rPr>
-      <w:rFonts w:asciiTheme="majorHAnsi" w:eastAsiaTheme="majorEastAsia" w:hAnsiTheme="majorHAnsi" w:cstheme="majorBidi"/>
+      <w:rFonts w:asciiTheme="majorHAnsi" w:eastAsiaTheme="majorEastAsia" w:hAnsiTheme="majorHAnsi" w:cstheme="majorBidi" w:ascii="Calibri" w:hAnsi="Calibri"/>
       <w:b/>
       <w:bCs/>
-      <w:color w:val="365F91" w:themeColor="accent1" w:themeShade="BF"/>
+      <w:color w:val="1C5CAB"/>
       <w:sz w:val="28"/>
       <w:szCs w:val="28"/>
     </w:rPr>
@@ -2922,11 +2955,11 @@
       <w:outlineLvl w:val="1"/>
     </w:pPr>
     <w:rPr>
-      <w:rFonts w:asciiTheme="majorHAnsi" w:eastAsiaTheme="majorEastAsia" w:hAnsiTheme="majorHAnsi" w:cstheme="majorBidi"/>
+      <w:rFonts w:asciiTheme="majorHAnsi" w:eastAsiaTheme="majorEastAsia" w:hAnsiTheme="majorHAnsi" w:cstheme="majorBidi" w:ascii="Calibri" w:hAnsi="Calibri"/>
       <w:b/>
       <w:bCs/>
-      <w:color w:val="4F81BD" w:themeColor="accent1"/>
-      <w:sz w:val="26"/>
+      <w:color w:val="1C5CAB"/>
+      <w:sz w:val="24"/>
       <w:szCs w:val="26"/>
     </w:rPr>
   </w:style>
@@ -2946,10 +2979,11 @@
       <w:outlineLvl w:val="2"/>
     </w:pPr>
     <w:rPr>
-      <w:rFonts w:asciiTheme="majorHAnsi" w:eastAsiaTheme="majorEastAsia" w:hAnsiTheme="majorHAnsi" w:cstheme="majorBidi"/>
+      <w:rFonts w:asciiTheme="majorHAnsi" w:eastAsiaTheme="majorEastAsia" w:hAnsiTheme="majorHAnsi" w:cstheme="majorBidi" w:ascii="Calibri" w:hAnsi="Calibri"/>
       <w:b/>
       <w:bCs/>
-      <w:color w:val="4F81BD" w:themeColor="accent1"/>
+      <w:color w:val="1C5CAB"/>
+      <w:sz w:val="22"/>
     </w:rPr>
   </w:style>
   <w:style w:type="paragraph" w:styleId="Heading4">
@@ -3187,11 +3221,12 @@
       <w:contextualSpacing/>
     </w:pPr>
     <w:rPr>
-      <w:rFonts w:asciiTheme="majorHAnsi" w:eastAsiaTheme="majorEastAsia" w:hAnsiTheme="majorHAnsi" w:cstheme="majorBidi"/>
-      <w:color w:val="17365D" w:themeColor="text2" w:themeShade="BF"/>
+      <w:rFonts w:asciiTheme="majorHAnsi" w:eastAsiaTheme="majorEastAsia" w:hAnsiTheme="majorHAnsi" w:cstheme="majorBidi" w:ascii="Calibri" w:hAnsi="Calibri"/>
+      <w:b/>
+      <w:color w:val="111111"/>
       <w:spacing w:val="5"/>
       <w:kern w:val="28"/>
-      <w:sz w:val="52"/>
+      <w:sz w:val="44"/>
       <w:szCs w:val="52"/>
     </w:rPr>
   </w:style>

</xml_diff>